<commit_message>
feat: update UBWC frame control and configuration flow
</commit_message>
<xml_diff>
--- a/docs/ubwc_software_usage_cn.docx
+++ b/docs/ubwc_software_usage_cn.docx
@@ -709,7 +709,7 @@
           <w:szCs w:val="22"/>
           <w:rFonts w:ascii="Arial" w:hAnsi="Arial" w:eastAsia="Microsoft YaHei"/>
         </w:rPr>
-        <w:t>连续帧模式下，如果格式、分辨率、tile layout 和 OTF timing 不变，软件通常只需要每帧更新 UBWC buffer base address。</w:t>
+        <w:t>连续帧模式下，ENC 复用最近一次 START 锁存的唯一地址组，地址不变时无需每帧重写；DEC 仍按每帧输入 UBWC buffer 配置地址。</w:t>
       </w:r>
     </w:p>
     <w:p>
@@ -844,7 +844,7 @@
                 <w:szCs w:val="19"/>
                 <w:rFonts w:ascii="Arial" w:hAnsi="Arial" w:eastAsia="Microsoft YaHei"/>
               </w:rPr>
-              <w:t>读取 VERSION/DATE；使能中断；配置格式、尺寸、tile layout、CI/VIVO、metadata geometry、DEC OTF timing；写入第一帧 ENC/DEC 地址。</w:t>
+              <w:t>读取 VERSION/DATE；使能中断；配置格式、尺寸、tile layout、CI/VIVO、metadata geometry、DEC OTF timing。ENC 写唯一输出地址组并写 START；DEC 写第一帧输入地址。</w:t>
             </w:r>
           </w:p>
         </w:tc>
@@ -894,7 +894,7 @@
                 <w:szCs w:val="19"/>
                 <w:rFonts w:ascii="Arial" w:hAnsi="Arial" w:eastAsia="Microsoft YaHei"/>
               </w:rPr>
-              <w:t>如果格式、尺寸、layout、timing 不变，只写新一帧的 base address；ENC 等上游 OTF 输入，DEC 地址写好后硬件按配置自动处理。</w:t>
+              <w:t>ENC 地址不变时直接复用；地址变化时重写唯一地址组并写 START。DEC 仍按每帧输入 UBWC buffer 配置地址。</w:t>
             </w:r>
           </w:p>
         </w:tc>
@@ -2630,7 +2630,7 @@
                 <w:szCs w:val="19"/>
                 <w:rFonts w:ascii="Arial" w:hAnsi="Arial" w:eastAsia="Microsoft YaHei"/>
               </w:rPr>
-              <w:t>每次配置</w:t>
+              <w:t>首次或地址变化时配置</w:t>
             </w:r>
           </w:p>
         </w:tc>
@@ -2654,7 +2654,7 @@
                 <w:szCs w:val="19"/>
                 <w:rFonts w:ascii="Arial" w:hAnsi="Arial" w:eastAsia="Microsoft YaHei"/>
               </w:rPr>
-              <w:t>压缩后 Y metadata 存储基地址低 32 bit；RGBA 使用该槽位</w:t>
+              <w:t>唯一 Y/RGBA metadata 存储基地址低 32 bit</w:t>
             </w:r>
           </w:p>
         </w:tc>
@@ -2728,7 +2728,7 @@
                 <w:szCs w:val="19"/>
                 <w:rFonts w:ascii="Arial" w:hAnsi="Arial" w:eastAsia="Microsoft YaHei"/>
               </w:rPr>
-              <w:t>每次配置</w:t>
+              <w:t>首次或地址变化时配置</w:t>
             </w:r>
           </w:p>
         </w:tc>
@@ -2752,7 +2752,7 @@
                 <w:szCs w:val="19"/>
                 <w:rFonts w:ascii="Arial" w:hAnsi="Arial" w:eastAsia="Microsoft YaHei"/>
               </w:rPr>
-              <w:t>压缩后 Y metadata 存储基地址高 32 bit；RGBA 使用该槽位</w:t>
+              <w:t>唯一 Y/RGBA metadata 存储基地址高 32 bit</w:t>
             </w:r>
           </w:p>
         </w:tc>
@@ -2826,7 +2826,7 @@
                 <w:szCs w:val="19"/>
                 <w:rFonts w:ascii="Arial" w:hAnsi="Arial" w:eastAsia="Microsoft YaHei"/>
               </w:rPr>
-              <w:t>每次配置</w:t>
+              <w:t>首次或地址变化时配置</w:t>
             </w:r>
           </w:p>
         </w:tc>
@@ -2850,7 +2850,7 @@
                 <w:szCs w:val="19"/>
                 <w:rFonts w:ascii="Arial" w:hAnsi="Arial" w:eastAsia="Microsoft YaHei"/>
               </w:rPr>
-              <w:t>压缩后 Y 压缩数据存储基地址低 32 bit；RGBA 使用该槽位</w:t>
+              <w:t>唯一 Y/RGBA 压缩数据存储基地址低 32 bit</w:t>
             </w:r>
           </w:p>
         </w:tc>
@@ -2924,7 +2924,7 @@
                 <w:szCs w:val="19"/>
                 <w:rFonts w:ascii="Arial" w:hAnsi="Arial" w:eastAsia="Microsoft YaHei"/>
               </w:rPr>
-              <w:t>每次配置</w:t>
+              <w:t>首次或地址变化时配置</w:t>
             </w:r>
           </w:p>
         </w:tc>
@@ -2948,7 +2948,7 @@
                 <w:szCs w:val="19"/>
                 <w:rFonts w:ascii="Arial" w:hAnsi="Arial" w:eastAsia="Microsoft YaHei"/>
               </w:rPr>
-              <w:t>压缩后 Y 压缩数据存储基地址高 32 bit；RGBA 使用该槽位</w:t>
+              <w:t>唯一 Y/RGBA 压缩数据存储基地址高 32 bit</w:t>
             </w:r>
           </w:p>
         </w:tc>
@@ -3022,7 +3022,7 @@
                 <w:szCs w:val="19"/>
                 <w:rFonts w:ascii="Arial" w:hAnsi="Arial" w:eastAsia="Microsoft YaHei"/>
               </w:rPr>
-              <w:t>每次配置</w:t>
+              <w:t>首次或地址变化时配置</w:t>
             </w:r>
           </w:p>
         </w:tc>
@@ -3046,7 +3046,7 @@
                 <w:szCs w:val="19"/>
                 <w:rFonts w:ascii="Arial" w:hAnsi="Arial" w:eastAsia="Microsoft YaHei"/>
               </w:rPr>
-              <w:t>压缩后 UV metadata 存储基地址低 32 bit；RGBA 写 0</w:t>
+              <w:t>唯一 UV metadata 存储基地址低 32 bit；RGBA 写 0</w:t>
             </w:r>
           </w:p>
         </w:tc>
@@ -3120,7 +3120,7 @@
                 <w:szCs w:val="19"/>
                 <w:rFonts w:ascii="Arial" w:hAnsi="Arial" w:eastAsia="Microsoft YaHei"/>
               </w:rPr>
-              <w:t>每次配置</w:t>
+              <w:t>首次或地址变化时配置</w:t>
             </w:r>
           </w:p>
         </w:tc>
@@ -3144,7 +3144,7 @@
                 <w:szCs w:val="19"/>
                 <w:rFonts w:ascii="Arial" w:hAnsi="Arial" w:eastAsia="Microsoft YaHei"/>
               </w:rPr>
-              <w:t>压缩后 UV metadata 存储基地址高 32 bit；RGBA 写 0</w:t>
+              <w:t>唯一 UV metadata 存储基地址高 32 bit；RGBA 写 0</w:t>
             </w:r>
           </w:p>
         </w:tc>
@@ -3218,7 +3218,7 @@
                 <w:szCs w:val="19"/>
                 <w:rFonts w:ascii="Arial" w:hAnsi="Arial" w:eastAsia="Microsoft YaHei"/>
               </w:rPr>
-              <w:t>每次配置</w:t>
+              <w:t>首次或地址变化时配置</w:t>
             </w:r>
           </w:p>
         </w:tc>
@@ -3242,7 +3242,7 @@
                 <w:szCs w:val="19"/>
                 <w:rFonts w:ascii="Arial" w:hAnsi="Arial" w:eastAsia="Microsoft YaHei"/>
               </w:rPr>
-              <w:t>压缩后 UV 压缩数据存储基地址低 32 bit；RGBA 写 0</w:t>
+              <w:t>唯一 UV 压缩数据存储基地址低 32 bit；RGBA 写 0</w:t>
             </w:r>
           </w:p>
         </w:tc>
@@ -3316,7 +3316,7 @@
                 <w:szCs w:val="19"/>
                 <w:rFonts w:ascii="Arial" w:hAnsi="Arial" w:eastAsia="Microsoft YaHei"/>
               </w:rPr>
-              <w:t>每次配置</w:t>
+              <w:t>首次或地址变化时配置</w:t>
             </w:r>
           </w:p>
         </w:tc>
@@ -3340,7 +3340,105 @@
                 <w:szCs w:val="19"/>
                 <w:rFonts w:ascii="Arial" w:hAnsi="Arial" w:eastAsia="Microsoft YaHei"/>
               </w:rPr>
-              <w:t>压缩后 UV 压缩数据存储基地址高 32 bit；最后写入提交本帧地址组</w:t>
+              <w:t>唯一 UV 压缩数据存储基地址高 32 bit；必须作为地址组最后一笔写入</w:t>
+            </w:r>
+          </w:p>
+        </w:tc>
+      </w:tr>
+      <w:tr>
+        <w:tc>
+          <w:tcPr>
+            <w:tcW w:w="1350" w:type="dxa"/>
+            <w:tcMar>
+              <w:top w:w="90" w:type="dxa"/>
+              <w:left w:w="120" w:type="dxa"/>
+              <w:bottom w:w="90" w:type="dxa"/>
+              <w:right w:w="120" w:type="dxa"/>
+            </w:tcMar>
+          </w:tcPr>
+          <w:p>
+            <w:pPr>
+              <w:spacing w:after="60"/>
+            </w:pPr>
+            <w:r>
+              <w:rPr>
+                <w:sz w:val="19"/>
+                <w:szCs w:val="19"/>
+                <w:rFonts w:ascii="Arial" w:hAnsi="Arial" w:eastAsia="Microsoft YaHei"/>
+              </w:rPr>
+              <w:t>0x060[5]</w:t>
+            </w:r>
+          </w:p>
+        </w:tc>
+        <w:tc>
+          <w:tcPr>
+            <w:tcW w:w="2850" w:type="dxa"/>
+            <w:tcMar>
+              <w:top w:w="90" w:type="dxa"/>
+              <w:left w:w="120" w:type="dxa"/>
+              <w:bottom w:w="90" w:type="dxa"/>
+              <w:right w:w="120" w:type="dxa"/>
+            </w:tcMar>
+          </w:tcPr>
+          <w:p>
+            <w:pPr>
+              <w:spacing w:after="60"/>
+            </w:pPr>
+            <w:r>
+              <w:rPr>
+                <w:sz w:val="19"/>
+                <w:szCs w:val="19"/>
+                <w:rFonts w:ascii="Arial" w:hAnsi="Arial" w:eastAsia="Microsoft YaHei"/>
+              </w:rPr>
+              <w:t>START</w:t>
+            </w:r>
+          </w:p>
+        </w:tc>
+        <w:tc>
+          <w:tcPr>
+            <w:tcW w:w="1900" w:type="dxa"/>
+            <w:tcMar>
+              <w:top w:w="90" w:type="dxa"/>
+              <w:left w:w="120" w:type="dxa"/>
+              <w:bottom w:w="90" w:type="dxa"/>
+              <w:right w:w="120" w:type="dxa"/>
+            </w:tcMar>
+          </w:tcPr>
+          <w:p>
+            <w:pPr>
+              <w:spacing w:after="60"/>
+            </w:pPr>
+            <w:r>
+              <w:rPr>
+                <w:sz w:val="19"/>
+                <w:szCs w:val="19"/>
+                <w:rFonts w:ascii="Arial" w:hAnsi="Arial" w:eastAsia="Microsoft YaHei"/>
+              </w:rPr>
+              <w:t>首次、静态配置变化或地址变化时配置</w:t>
+            </w:r>
+          </w:p>
+        </w:tc>
+        <w:tc>
+          <w:tcPr>
+            <w:tcW w:w="3260" w:type="dxa"/>
+            <w:tcMar>
+              <w:top w:w="90" w:type="dxa"/>
+              <w:left w:w="120" w:type="dxa"/>
+              <w:bottom w:w="90" w:type="dxa"/>
+              <w:right w:w="120" w:type="dxa"/>
+            </w:tcMar>
+          </w:tcPr>
+          <w:p>
+            <w:pPr>
+              <w:spacing w:after="60"/>
+            </w:pPr>
+            <w:r>
+              <w:rPr>
+                <w:sz w:val="19"/>
+                <w:szCs w:val="19"/>
+                <w:rFonts w:ascii="Arial" w:hAnsi="Arial" w:eastAsia="Microsoft YaHei"/>
+              </w:rPr>
+              <w:t>写 1 校验并锁存完整配置；不直接启动帧</w:t>
             </w:r>
           </w:p>
         </w:tc>
@@ -5571,7 +5669,7 @@
           <w:szCs w:val="22"/>
           <w:rFonts w:ascii="Arial" w:hAnsi="Arial" w:eastAsia="Microsoft YaHei"/>
         </w:rPr>
-        <w:t>下面只列 ENC 静态几何相关寄存器，覆盖 RGBA8888、YUV420_8/NV12、YUV420_10/P010。每帧 base address 仍按实际输出 buffer 地址单独写入。</w:t>
+        <w:t>下面只列 ENC 静态几何相关寄存器，覆盖 RGBA8888、YUV420_8/NV12、YUV420_10/P010。唯一 base address 组在首次使用或输出地址变化时写入并通过 START 锁存。</w:t>
       </w:r>
     </w:p>
     <w:tbl>
@@ -13355,7 +13453,7 @@
           <w:szCs w:val="22"/>
           <w:rFonts w:ascii="Arial" w:hAnsi="Arial" w:eastAsia="Microsoft YaHei"/>
         </w:rPr>
-        <w:t>ENC 没有 APB start bit。软件先配置好静态参数和输出 buffer 地址，上游 OTF 输入流的 vsync/hsync/de/data 到来后，ENC 自动开始处理。</w:t>
+        <w:t>ENC 的 IRQ_CTRL[5] START 用于校验并锁存静态参数和唯一输出地址组，不直接启动帧。软件确认 STATUS0[14] cfg_valid 与 STATUS0[10] addr_cfg_valid 后，再送入 OTF VSYNC 和像素流。</w:t>
       </w:r>
     </w:p>
     <w:p>
@@ -13581,7 +13679,7 @@
           <w:szCs w:val="22"/>
           <w:rFonts w:ascii="Arial" w:hAnsi="Arial" w:eastAsia="Microsoft YaHei"/>
         </w:rPr>
-        <w:t>3.2 每帧地址配置</w:t>
+        <w:t>3.2 唯一地址组配置</w:t>
       </w:r>
     </w:p>
     <w:tbl>
@@ -13704,7 +13802,7 @@
                 <w:szCs w:val="19"/>
                 <w:rFonts w:ascii="Arial" w:hAnsi="Arial" w:eastAsia="Microsoft YaHei"/>
               </w:rPr>
-              <w:t>Y metadata base</w:t>
+              <w:t>Y/RGBA metadata base</w:t>
             </w:r>
           </w:p>
         </w:tc>
@@ -13752,7 +13850,7 @@
                 <w:szCs w:val="19"/>
                 <w:rFonts w:ascii="Arial" w:hAnsi="Arial" w:eastAsia="Microsoft YaHei"/>
               </w:rPr>
-              <w:t>低 32 bit / 高 32 bit；RGBA 使用该槽位</w:t>
+              <w:t>唯一地址，低 32 bit / 高 32 bit</w:t>
             </w:r>
           </w:p>
         </w:tc>
@@ -13778,7 +13876,7 @@
                 <w:szCs w:val="19"/>
                 <w:rFonts w:ascii="Arial" w:hAnsi="Arial" w:eastAsia="Microsoft YaHei"/>
               </w:rPr>
-              <w:t>Y tile base</w:t>
+              <w:t>Y/RGBA tile base</w:t>
             </w:r>
           </w:p>
         </w:tc>
@@ -13826,7 +13924,7 @@
                 <w:szCs w:val="19"/>
                 <w:rFonts w:ascii="Arial" w:hAnsi="Arial" w:eastAsia="Microsoft YaHei"/>
               </w:rPr>
-              <w:t>低 32 bit / 高 32 bit；RGBA 使用该槽位</w:t>
+              <w:t>唯一地址，低 32 bit / 高 32 bit</w:t>
             </w:r>
           </w:p>
         </w:tc>
@@ -13974,7 +14072,7 @@
                 <w:szCs w:val="19"/>
                 <w:rFonts w:ascii="Arial" w:hAnsi="Arial" w:eastAsia="Microsoft YaHei"/>
               </w:rPr>
-              <w:t>低 32 bit / 高 32 bit；最后写 0x04C high 提交本帧地址组</w:t>
+              <w:t>低 32 bit / 高 32 bit；必须最后写 0x04C high 标记工作地址组完整</w:t>
             </w:r>
           </w:p>
         </w:tc>
@@ -13990,7 +14088,7 @@
           <w:szCs w:val="22"/>
           <w:rFonts w:ascii="Arial" w:hAnsi="Arial" w:eastAsia="Microsoft YaHei"/>
         </w:rPr>
-        <w:t>写入顺序建议：按 meta Y、tile Y、meta UV、tile UV 顺序写。REG_TILE_BASE_UV_HI @ 0x04C 必须作为本帧地址组最后一笔写入，使本帧四个 base 地址生效。</w:t>
+        <w:t>写入顺序：按 meta Y、tile Y、meta UV、tile UV 顺序写。REG_TILE_BASE_UV_HI @ 0x04C 必须作为地址组最后一笔写入；随后写 IRQ_CTRL[5] START，并读取 STATUS0[14] 与 STATUS0[10] 确认提交成功。</w:t>
       </w:r>
     </w:p>
     <w:p>
@@ -14018,7 +14116,7 @@
           <w:szCs w:val="22"/>
           <w:rFonts w:ascii="Arial" w:hAnsi="Arial" w:eastAsia="Microsoft YaHei"/>
         </w:rPr>
-        <w:t>如果格式和尺寸不变，后续帧只需要重复 3.2 的每帧地址配置，然后送入下一帧 OTF 输入流。</w:t>
+        <w:t>地址不变时，后续帧直接复用已锁存地址组并送入下一帧 OTF 输入流。输出地址变化时，重新执行 3.2 并写 START；fcnt[0] 不参与地址选择。</w:t>
       </w:r>
     </w:p>
     <w:p>
@@ -16320,7 +16418,7 @@
                 <w:szCs w:val="19"/>
                 <w:rFonts w:ascii="Arial" w:hAnsi="Arial" w:eastAsia="Microsoft YaHei"/>
               </w:rPr>
-              <w:t>idle/error/busy/frame_done/addr_cfg_invalid/addr_cfg_valid0/1</w:t>
+              <w:t>idle/error/busy/frame_done/addr_cfg_invalid/addr_cfg_valid/cfg_valid</w:t>
             </w:r>
           </w:p>
         </w:tc>

</xml_diff>